<commit_message>
Update report generation and screenshot layout
</commit_message>
<xml_diff>
--- a/reports/X_Report.docx
+++ b/reports/X_Report.docx
@@ -15,22 +15,31 @@
       <w:tblPr>
         <w:tblStyle w:val="TableGrid"/>
         <w:tblW w:type="auto" w:w="0"/>
+        <w:tblLayout w:type="fixed"/>
         <w:tblLook w:firstColumn="1" w:firstRow="1" w:lastColumn="0" w:lastRow="0" w:noHBand="0" w:noVBand="1" w:val="04A0"/>
       </w:tblPr>
       <w:tblGrid>
-        <w:gridCol w:w="2160"/>
-        <w:gridCol w:w="2160"/>
-        <w:gridCol w:w="2160"/>
-        <w:gridCol w:w="2160"/>
+        <w:gridCol w:w="2189"/>
+        <w:gridCol w:w="2189"/>
+        <w:gridCol w:w="2189"/>
+        <w:gridCol w:w="2189"/>
+        <w:gridCol w:w="2189"/>
       </w:tblGrid>
       <w:tr>
         <w:tc>
           <w:tcPr>
-            <w:tcW w:type="dxa" w:w="2160"/>
+            <w:tcW w:type="dxa" w:w="648"/>
             <w:vAlign w:val="center"/>
+            <w:tcMar>
+              <w:top w:w="0" w:type="dxa"/>
+              <w:start w:w="60" w:type="dxa"/>
+              <w:bottom w:w="0" w:type="dxa"/>
+              <w:end w:w="60" w:type="dxa"/>
+            </w:tcMar>
           </w:tcPr>
           <w:p>
             <w:pPr>
+              <w:spacing w:before="0" w:after="0" w:line="240" w:lineRule="auto"/>
               <w:jc w:val="center"/>
             </w:pPr>
             <w:r>
@@ -43,11 +52,18 @@
         </w:tc>
         <w:tc>
           <w:tcPr>
-            <w:tcW w:type="dxa" w:w="2160"/>
+            <w:tcW w:type="dxa" w:w="3816"/>
             <w:vAlign w:val="center"/>
+            <w:tcMar>
+              <w:top w:w="0" w:type="dxa"/>
+              <w:start w:w="60" w:type="dxa"/>
+              <w:bottom w:w="0" w:type="dxa"/>
+              <w:end w:w="60" w:type="dxa"/>
+            </w:tcMar>
           </w:tcPr>
           <w:p>
             <w:pPr>
+              <w:spacing w:before="0" w:after="0" w:line="240" w:lineRule="auto"/>
               <w:jc w:val="center"/>
             </w:pPr>
             <w:r>
@@ -60,11 +76,18 @@
         </w:tc>
         <w:tc>
           <w:tcPr>
-            <w:tcW w:type="dxa" w:w="2160"/>
+            <w:tcW w:type="dxa" w:w="2664"/>
             <w:vAlign w:val="center"/>
+            <w:tcMar>
+              <w:top w:w="0" w:type="dxa"/>
+              <w:start w:w="60" w:type="dxa"/>
+              <w:bottom w:w="0" w:type="dxa"/>
+              <w:end w:w="60" w:type="dxa"/>
+            </w:tcMar>
           </w:tcPr>
           <w:p>
             <w:pPr>
+              <w:spacing w:before="0" w:after="0" w:line="240" w:lineRule="auto"/>
               <w:jc w:val="center"/>
             </w:pPr>
             <w:r>
@@ -77,11 +100,18 @@
         </w:tc>
         <w:tc>
           <w:tcPr>
-            <w:tcW w:type="dxa" w:w="2160"/>
+            <w:tcW w:type="dxa" w:w="1152"/>
             <w:vAlign w:val="center"/>
+            <w:tcMar>
+              <w:top w:w="0" w:type="dxa"/>
+              <w:start w:w="60" w:type="dxa"/>
+              <w:bottom w:w="0" w:type="dxa"/>
+              <w:end w:w="60" w:type="dxa"/>
+            </w:tcMar>
           </w:tcPr>
           <w:p>
             <w:pPr>
+              <w:spacing w:before="0" w:after="0" w:line="240" w:lineRule="auto"/>
               <w:jc w:val="center"/>
             </w:pPr>
             <w:r>
@@ -92,14 +122,48 @@
             </w:r>
           </w:p>
         </w:tc>
+        <w:tc>
+          <w:tcPr>
+            <w:tcW w:type="dxa" w:w="1080"/>
+            <w:vAlign w:val="center"/>
+            <w:tcMar>
+              <w:top w:w="0" w:type="dxa"/>
+              <w:start w:w="60" w:type="dxa"/>
+              <w:bottom w:w="0" w:type="dxa"/>
+              <w:end w:w="60" w:type="dxa"/>
+            </w:tcMar>
+          </w:tcPr>
+          <w:p>
+            <w:pPr>
+              <w:spacing w:before="0" w:after="0" w:line="240" w:lineRule="auto"/>
+              <w:jc w:val="center"/>
+            </w:pPr>
+            <w:r>
+              <w:rPr>
+                <w:b/>
+              </w:rPr>
+              <w:t>Profile Photo</w:t>
+            </w:r>
+          </w:p>
+        </w:tc>
       </w:tr>
       <w:tr>
         <w:tc>
           <w:tcPr>
-            <w:tcW w:type="dxa" w:w="2160"/>
+            <w:tcW w:type="dxa" w:w="648"/>
             <w:vAlign w:val="center"/>
+            <w:tcMar>
+              <w:top w:w="0" w:type="dxa"/>
+              <w:start w:w="60" w:type="dxa"/>
+              <w:bottom w:w="0" w:type="dxa"/>
+              <w:end w:w="60" w:type="dxa"/>
+            </w:tcMar>
           </w:tcPr>
           <w:p>
+            <w:pPr>
+              <w:spacing w:before="0" w:after="0" w:line="240" w:lineRule="auto"/>
+              <w:jc w:val="center"/>
+            </w:pPr>
             <w:r>
               <w:t>1</w:t>
             </w:r>
@@ -107,17 +171,24 @@
         </w:tc>
         <w:tc>
           <w:tcPr>
-            <w:tcW w:type="dxa" w:w="2160"/>
+            <w:tcW w:type="dxa" w:w="3816"/>
             <w:vAlign w:val="center"/>
+            <w:tcMar>
+              <w:top w:w="0" w:type="dxa"/>
+              <w:start w:w="60" w:type="dxa"/>
+              <w:bottom w:w="0" w:type="dxa"/>
+              <w:end w:w="60" w:type="dxa"/>
+            </w:tcMar>
           </w:tcPr>
           <w:p>
             <w:pPr>
+              <w:spacing w:before="0" w:after="0" w:line="240" w:lineRule="auto"/>
               <w:jc w:val="center"/>
             </w:pPr>
             <w:r>
               <w:drawing>
                 <wp:inline xmlns:a="http://schemas.openxmlformats.org/drawingml/2006/main" xmlns:pic="http://schemas.openxmlformats.org/drawingml/2006/picture">
-                  <wp:extent cx="2103120" cy="2428955"/>
+                  <wp:extent cx="2377440" cy="3836696"/>
                   <wp:docPr id="1" name="Picture 1"/>
                   <wp:cNvGraphicFramePr>
                     <a:graphicFrameLocks noChangeAspect="1"/>
@@ -138,7 +209,7 @@
                         <pic:spPr>
                           <a:xfrm>
                             <a:off x="0" y="0"/>
-                            <a:ext cx="2103120" cy="2428955"/>
+                            <a:ext cx="2377440" cy="3836696"/>
                           </a:xfrm>
                           <a:prstGeom prst="rect"/>
                         </pic:spPr>
@@ -152,23 +223,602 @@
         </w:tc>
         <w:tc>
           <w:tcPr>
-            <w:tcW w:type="dxa" w:w="2160"/>
+            <w:tcW w:type="dxa" w:w="2664"/>
             <w:vAlign w:val="center"/>
+            <w:tcMar>
+              <w:top w:w="0" w:type="dxa"/>
+              <w:start w:w="60" w:type="dxa"/>
+              <w:bottom w:w="0" w:type="dxa"/>
+              <w:end w:w="60" w:type="dxa"/>
+            </w:tcMar>
           </w:tcPr>
           <w:p>
+            <w:pPr>
+              <w:spacing w:before="0" w:after="0" w:line="240" w:lineRule="auto"/>
+              <w:jc w:val="center"/>
+            </w:pPr>
             <w:r>
-              <w:t>https://x.com/ecoenep/status/2093896310814654944</w:t>
+              <w:t>https://x.com/leomorgan2030/status/2096050724266500534</w:t>
             </w:r>
           </w:p>
         </w:tc>
         <w:tc>
           <w:tcPr>
-            <w:tcW w:type="dxa" w:w="2160"/>
+            <w:tcW w:type="dxa" w:w="1152"/>
             <w:vAlign w:val="center"/>
+            <w:tcMar>
+              <w:top w:w="0" w:type="dxa"/>
+              <w:start w:w="60" w:type="dxa"/>
+              <w:bottom w:w="0" w:type="dxa"/>
+              <w:end w:w="60" w:type="dxa"/>
+            </w:tcMar>
           </w:tcPr>
           <w:p>
+            <w:pPr>
+              <w:spacing w:before="0" w:after="0" w:line="240" w:lineRule="auto"/>
+              <w:jc w:val="center"/>
+            </w:pPr>
             <w:r>
-              <w:t>@ecoenep</w:t>
+              <w:t>@leomorgan2030</w:t>
+            </w:r>
+          </w:p>
+        </w:tc>
+        <w:tc>
+          <w:tcPr>
+            <w:tcW w:type="dxa" w:w="1080"/>
+            <w:vAlign w:val="center"/>
+            <w:tcMar>
+              <w:top w:w="0" w:type="dxa"/>
+              <w:start w:w="60" w:type="dxa"/>
+              <w:bottom w:w="0" w:type="dxa"/>
+              <w:end w:w="60" w:type="dxa"/>
+            </w:tcMar>
+          </w:tcPr>
+          <w:p>
+            <w:pPr>
+              <w:spacing w:before="0" w:after="0" w:line="240" w:lineRule="auto"/>
+              <w:jc w:val="center"/>
+            </w:pPr>
+            <w:r>
+              <w:drawing>
+                <wp:inline xmlns:a="http://schemas.openxmlformats.org/drawingml/2006/main" xmlns:pic="http://schemas.openxmlformats.org/drawingml/2006/picture">
+                  <wp:extent cx="438912" cy="438912"/>
+                  <wp:docPr id="2" name="Picture 2"/>
+                  <wp:cNvGraphicFramePr>
+                    <a:graphicFrameLocks noChangeAspect="1"/>
+                  </wp:cNvGraphicFramePr>
+                  <a:graphic>
+                    <a:graphicData uri="http://schemas.openxmlformats.org/drawingml/2006/picture">
+                      <pic:pic>
+                        <pic:nvPicPr>
+                          <pic:cNvPr id="0" name="profile_1.jpg"/>
+                          <pic:cNvPicPr/>
+                        </pic:nvPicPr>
+                        <pic:blipFill>
+                          <a:blip r:embed="rId10"/>
+                          <a:stretch>
+                            <a:fillRect/>
+                          </a:stretch>
+                        </pic:blipFill>
+                        <pic:spPr>
+                          <a:xfrm>
+                            <a:off x="0" y="0"/>
+                            <a:ext cx="438912" cy="438912"/>
+                          </a:xfrm>
+                          <a:prstGeom prst="rect"/>
+                        </pic:spPr>
+                      </pic:pic>
+                    </a:graphicData>
+                  </a:graphic>
+                </wp:inline>
+              </w:drawing>
+            </w:r>
+          </w:p>
+        </w:tc>
+      </w:tr>
+      <w:tr>
+        <w:tc>
+          <w:tcPr>
+            <w:tcW w:type="dxa" w:w="648"/>
+            <w:vAlign w:val="center"/>
+            <w:tcMar>
+              <w:top w:w="0" w:type="dxa"/>
+              <w:start w:w="60" w:type="dxa"/>
+              <w:bottom w:w="0" w:type="dxa"/>
+              <w:end w:w="60" w:type="dxa"/>
+            </w:tcMar>
+          </w:tcPr>
+          <w:p>
+            <w:pPr>
+              <w:spacing w:before="0" w:after="0" w:line="240" w:lineRule="auto"/>
+              <w:jc w:val="center"/>
+            </w:pPr>
+            <w:r>
+              <w:t>2</w:t>
+            </w:r>
+          </w:p>
+        </w:tc>
+        <w:tc>
+          <w:tcPr>
+            <w:tcW w:type="dxa" w:w="3816"/>
+            <w:vAlign w:val="center"/>
+            <w:tcMar>
+              <w:top w:w="0" w:type="dxa"/>
+              <w:start w:w="60" w:type="dxa"/>
+              <w:bottom w:w="0" w:type="dxa"/>
+              <w:end w:w="60" w:type="dxa"/>
+            </w:tcMar>
+          </w:tcPr>
+          <w:p>
+            <w:pPr>
+              <w:spacing w:before="0" w:after="0" w:line="240" w:lineRule="auto"/>
+              <w:jc w:val="center"/>
+            </w:pPr>
+            <w:r>
+              <w:drawing>
+                <wp:inline xmlns:a="http://schemas.openxmlformats.org/drawingml/2006/main" xmlns:pic="http://schemas.openxmlformats.org/drawingml/2006/picture">
+                  <wp:extent cx="2377440" cy="1385474"/>
+                  <wp:docPr id="3" name="Picture 3"/>
+                  <wp:cNvGraphicFramePr>
+                    <a:graphicFrameLocks noChangeAspect="1"/>
+                  </wp:cNvGraphicFramePr>
+                  <a:graphic>
+                    <a:graphicData uri="http://schemas.openxmlformats.org/drawingml/2006/picture">
+                      <pic:pic>
+                        <pic:nvPicPr>
+                          <pic:cNvPr id="0" name="post_2.png"/>
+                          <pic:cNvPicPr/>
+                        </pic:nvPicPr>
+                        <pic:blipFill>
+                          <a:blip r:embed="rId11"/>
+                          <a:stretch>
+                            <a:fillRect/>
+                          </a:stretch>
+                        </pic:blipFill>
+                        <pic:spPr>
+                          <a:xfrm>
+                            <a:off x="0" y="0"/>
+                            <a:ext cx="2377440" cy="1385474"/>
+                          </a:xfrm>
+                          <a:prstGeom prst="rect"/>
+                        </pic:spPr>
+                      </pic:pic>
+                    </a:graphicData>
+                  </a:graphic>
+                </wp:inline>
+              </w:drawing>
+            </w:r>
+          </w:p>
+        </w:tc>
+        <w:tc>
+          <w:tcPr>
+            <w:tcW w:type="dxa" w:w="2664"/>
+            <w:vAlign w:val="center"/>
+            <w:tcMar>
+              <w:top w:w="0" w:type="dxa"/>
+              <w:start w:w="60" w:type="dxa"/>
+              <w:bottom w:w="0" w:type="dxa"/>
+              <w:end w:w="60" w:type="dxa"/>
+            </w:tcMar>
+          </w:tcPr>
+          <w:p>
+            <w:pPr>
+              <w:spacing w:before="0" w:after="0" w:line="240" w:lineRule="auto"/>
+              <w:jc w:val="center"/>
+            </w:pPr>
+            <w:r>
+              <w:t>https://x.com/Buntymeghwal18/status/2096050692792394204</w:t>
+            </w:r>
+          </w:p>
+        </w:tc>
+        <w:tc>
+          <w:tcPr>
+            <w:tcW w:type="dxa" w:w="1152"/>
+            <w:vAlign w:val="center"/>
+            <w:tcMar>
+              <w:top w:w="0" w:type="dxa"/>
+              <w:start w:w="60" w:type="dxa"/>
+              <w:bottom w:w="0" w:type="dxa"/>
+              <w:end w:w="60" w:type="dxa"/>
+            </w:tcMar>
+          </w:tcPr>
+          <w:p>
+            <w:pPr>
+              <w:spacing w:before="0" w:after="0" w:line="240" w:lineRule="auto"/>
+              <w:jc w:val="center"/>
+            </w:pPr>
+            <w:r>
+              <w:t>@Buntymeghwal18</w:t>
+            </w:r>
+          </w:p>
+        </w:tc>
+        <w:tc>
+          <w:tcPr>
+            <w:tcW w:type="dxa" w:w="1080"/>
+            <w:vAlign w:val="center"/>
+            <w:tcMar>
+              <w:top w:w="0" w:type="dxa"/>
+              <w:start w:w="60" w:type="dxa"/>
+              <w:bottom w:w="0" w:type="dxa"/>
+              <w:end w:w="60" w:type="dxa"/>
+            </w:tcMar>
+          </w:tcPr>
+          <w:p>
+            <w:pPr>
+              <w:spacing w:before="0" w:after="0" w:line="240" w:lineRule="auto"/>
+              <w:jc w:val="center"/>
+            </w:pPr>
+            <w:r>
+              <w:drawing>
+                <wp:inline xmlns:a="http://schemas.openxmlformats.org/drawingml/2006/main" xmlns:pic="http://schemas.openxmlformats.org/drawingml/2006/picture">
+                  <wp:extent cx="438912" cy="438912"/>
+                  <wp:docPr id="4" name="Picture 4"/>
+                  <wp:cNvGraphicFramePr>
+                    <a:graphicFrameLocks noChangeAspect="1"/>
+                  </wp:cNvGraphicFramePr>
+                  <a:graphic>
+                    <a:graphicData uri="http://schemas.openxmlformats.org/drawingml/2006/picture">
+                      <pic:pic>
+                        <pic:nvPicPr>
+                          <pic:cNvPr id="0" name="profile_2.jpg"/>
+                          <pic:cNvPicPr/>
+                        </pic:nvPicPr>
+                        <pic:blipFill>
+                          <a:blip r:embed="rId12"/>
+                          <a:stretch>
+                            <a:fillRect/>
+                          </a:stretch>
+                        </pic:blipFill>
+                        <pic:spPr>
+                          <a:xfrm>
+                            <a:off x="0" y="0"/>
+                            <a:ext cx="438912" cy="438912"/>
+                          </a:xfrm>
+                          <a:prstGeom prst="rect"/>
+                        </pic:spPr>
+                      </pic:pic>
+                    </a:graphicData>
+                  </a:graphic>
+                </wp:inline>
+              </w:drawing>
+            </w:r>
+          </w:p>
+        </w:tc>
+      </w:tr>
+      <w:tr>
+        <w:tc>
+          <w:tcPr>
+            <w:tcW w:type="dxa" w:w="648"/>
+            <w:vAlign w:val="center"/>
+            <w:tcMar>
+              <w:top w:w="0" w:type="dxa"/>
+              <w:start w:w="60" w:type="dxa"/>
+              <w:bottom w:w="0" w:type="dxa"/>
+              <w:end w:w="60" w:type="dxa"/>
+            </w:tcMar>
+          </w:tcPr>
+          <w:p>
+            <w:pPr>
+              <w:spacing w:before="0" w:after="0" w:line="240" w:lineRule="auto"/>
+              <w:jc w:val="center"/>
+            </w:pPr>
+            <w:r>
+              <w:t>3</w:t>
+            </w:r>
+          </w:p>
+        </w:tc>
+        <w:tc>
+          <w:tcPr>
+            <w:tcW w:type="dxa" w:w="3816"/>
+            <w:vAlign w:val="center"/>
+            <w:tcMar>
+              <w:top w:w="0" w:type="dxa"/>
+              <w:start w:w="60" w:type="dxa"/>
+              <w:bottom w:w="0" w:type="dxa"/>
+              <w:end w:w="60" w:type="dxa"/>
+            </w:tcMar>
+          </w:tcPr>
+          <w:p>
+            <w:pPr>
+              <w:spacing w:before="0" w:after="0" w:line="240" w:lineRule="auto"/>
+              <w:jc w:val="center"/>
+            </w:pPr>
+            <w:r>
+              <w:drawing>
+                <wp:inline xmlns:a="http://schemas.openxmlformats.org/drawingml/2006/main" xmlns:pic="http://schemas.openxmlformats.org/drawingml/2006/picture">
+                  <wp:extent cx="2377440" cy="1385474"/>
+                  <wp:docPr id="5" name="Picture 5"/>
+                  <wp:cNvGraphicFramePr>
+                    <a:graphicFrameLocks noChangeAspect="1"/>
+                  </wp:cNvGraphicFramePr>
+                  <a:graphic>
+                    <a:graphicData uri="http://schemas.openxmlformats.org/drawingml/2006/picture">
+                      <pic:pic>
+                        <pic:nvPicPr>
+                          <pic:cNvPr id="0" name="post_3.png"/>
+                          <pic:cNvPicPr/>
+                        </pic:nvPicPr>
+                        <pic:blipFill>
+                          <a:blip r:embed="rId13"/>
+                          <a:stretch>
+                            <a:fillRect/>
+                          </a:stretch>
+                        </pic:blipFill>
+                        <pic:spPr>
+                          <a:xfrm>
+                            <a:off x="0" y="0"/>
+                            <a:ext cx="2377440" cy="1385474"/>
+                          </a:xfrm>
+                          <a:prstGeom prst="rect"/>
+                        </pic:spPr>
+                      </pic:pic>
+                    </a:graphicData>
+                  </a:graphic>
+                </wp:inline>
+              </w:drawing>
+            </w:r>
+          </w:p>
+        </w:tc>
+        <w:tc>
+          <w:tcPr>
+            <w:tcW w:type="dxa" w:w="2664"/>
+            <w:vAlign w:val="center"/>
+            <w:tcMar>
+              <w:top w:w="0" w:type="dxa"/>
+              <w:start w:w="60" w:type="dxa"/>
+              <w:bottom w:w="0" w:type="dxa"/>
+              <w:end w:w="60" w:type="dxa"/>
+            </w:tcMar>
+          </w:tcPr>
+          <w:p>
+            <w:pPr>
+              <w:spacing w:before="0" w:after="0" w:line="240" w:lineRule="auto"/>
+              <w:jc w:val="center"/>
+            </w:pPr>
+            <w:r>
+              <w:t>https://x.com/FootyFinLab/status/2096050683061678469</w:t>
+            </w:r>
+          </w:p>
+        </w:tc>
+        <w:tc>
+          <w:tcPr>
+            <w:tcW w:type="dxa" w:w="1152"/>
+            <w:vAlign w:val="center"/>
+            <w:tcMar>
+              <w:top w:w="0" w:type="dxa"/>
+              <w:start w:w="60" w:type="dxa"/>
+              <w:bottom w:w="0" w:type="dxa"/>
+              <w:end w:w="60" w:type="dxa"/>
+            </w:tcMar>
+          </w:tcPr>
+          <w:p>
+            <w:pPr>
+              <w:spacing w:before="0" w:after="0" w:line="240" w:lineRule="auto"/>
+              <w:jc w:val="center"/>
+            </w:pPr>
+            <w:r>
+              <w:t>@FootyFinLab</w:t>
+            </w:r>
+          </w:p>
+        </w:tc>
+        <w:tc>
+          <w:tcPr>
+            <w:tcW w:type="dxa" w:w="1080"/>
+            <w:vAlign w:val="center"/>
+            <w:tcMar>
+              <w:top w:w="0" w:type="dxa"/>
+              <w:start w:w="60" w:type="dxa"/>
+              <w:bottom w:w="0" w:type="dxa"/>
+              <w:end w:w="60" w:type="dxa"/>
+            </w:tcMar>
+          </w:tcPr>
+          <w:p>
+            <w:pPr>
+              <w:spacing w:before="0" w:after="0" w:line="240" w:lineRule="auto"/>
+              <w:jc w:val="center"/>
+            </w:pPr>
+            <w:r>
+              <w:drawing>
+                <wp:inline xmlns:a="http://schemas.openxmlformats.org/drawingml/2006/main" xmlns:pic="http://schemas.openxmlformats.org/drawingml/2006/picture">
+                  <wp:extent cx="438912" cy="438912"/>
+                  <wp:docPr id="6" name="Picture 6"/>
+                  <wp:cNvGraphicFramePr>
+                    <a:graphicFrameLocks noChangeAspect="1"/>
+                  </wp:cNvGraphicFramePr>
+                  <a:graphic>
+                    <a:graphicData uri="http://schemas.openxmlformats.org/drawingml/2006/picture">
+                      <pic:pic>
+                        <pic:nvPicPr>
+                          <pic:cNvPr id="0" name="profile_3.jpg"/>
+                          <pic:cNvPicPr/>
+                        </pic:nvPicPr>
+                        <pic:blipFill>
+                          <a:blip r:embed="rId14"/>
+                          <a:stretch>
+                            <a:fillRect/>
+                          </a:stretch>
+                        </pic:blipFill>
+                        <pic:spPr>
+                          <a:xfrm>
+                            <a:off x="0" y="0"/>
+                            <a:ext cx="438912" cy="438912"/>
+                          </a:xfrm>
+                          <a:prstGeom prst="rect"/>
+                        </pic:spPr>
+                      </pic:pic>
+                    </a:graphicData>
+                  </a:graphic>
+                </wp:inline>
+              </w:drawing>
+            </w:r>
+          </w:p>
+        </w:tc>
+      </w:tr>
+      <w:tr>
+        <w:tc>
+          <w:tcPr>
+            <w:tcW w:type="dxa" w:w="648"/>
+            <w:vAlign w:val="center"/>
+            <w:tcMar>
+              <w:top w:w="0" w:type="dxa"/>
+              <w:start w:w="60" w:type="dxa"/>
+              <w:bottom w:w="0" w:type="dxa"/>
+              <w:end w:w="60" w:type="dxa"/>
+            </w:tcMar>
+          </w:tcPr>
+          <w:p>
+            <w:pPr>
+              <w:spacing w:before="0" w:after="0" w:line="240" w:lineRule="auto"/>
+              <w:jc w:val="center"/>
+            </w:pPr>
+            <w:r>
+              <w:t>4</w:t>
+            </w:r>
+          </w:p>
+        </w:tc>
+        <w:tc>
+          <w:tcPr>
+            <w:tcW w:type="dxa" w:w="3816"/>
+            <w:vAlign w:val="center"/>
+            <w:tcMar>
+              <w:top w:w="0" w:type="dxa"/>
+              <w:start w:w="60" w:type="dxa"/>
+              <w:bottom w:w="0" w:type="dxa"/>
+              <w:end w:w="60" w:type="dxa"/>
+            </w:tcMar>
+          </w:tcPr>
+          <w:p>
+            <w:pPr>
+              <w:spacing w:before="0" w:after="0" w:line="240" w:lineRule="auto"/>
+              <w:jc w:val="center"/>
+            </w:pPr>
+            <w:r>
+              <w:drawing>
+                <wp:inline xmlns:a="http://schemas.openxmlformats.org/drawingml/2006/main" xmlns:pic="http://schemas.openxmlformats.org/drawingml/2006/picture">
+                  <wp:extent cx="2377440" cy="4029351"/>
+                  <wp:docPr id="7" name="Picture 7"/>
+                  <wp:cNvGraphicFramePr>
+                    <a:graphicFrameLocks noChangeAspect="1"/>
+                  </wp:cNvGraphicFramePr>
+                  <a:graphic>
+                    <a:graphicData uri="http://schemas.openxmlformats.org/drawingml/2006/picture">
+                      <pic:pic>
+                        <pic:nvPicPr>
+                          <pic:cNvPr id="0" name="post_4.png"/>
+                          <pic:cNvPicPr/>
+                        </pic:nvPicPr>
+                        <pic:blipFill>
+                          <a:blip r:embed="rId15"/>
+                          <a:stretch>
+                            <a:fillRect/>
+                          </a:stretch>
+                        </pic:blipFill>
+                        <pic:spPr>
+                          <a:xfrm>
+                            <a:off x="0" y="0"/>
+                            <a:ext cx="2377440" cy="4029351"/>
+                          </a:xfrm>
+                          <a:prstGeom prst="rect"/>
+                        </pic:spPr>
+                      </pic:pic>
+                    </a:graphicData>
+                  </a:graphic>
+                </wp:inline>
+              </w:drawing>
+            </w:r>
+          </w:p>
+        </w:tc>
+        <w:tc>
+          <w:tcPr>
+            <w:tcW w:type="dxa" w:w="2664"/>
+            <w:vAlign w:val="center"/>
+            <w:tcMar>
+              <w:top w:w="0" w:type="dxa"/>
+              <w:start w:w="60" w:type="dxa"/>
+              <w:bottom w:w="0" w:type="dxa"/>
+              <w:end w:w="60" w:type="dxa"/>
+            </w:tcMar>
+          </w:tcPr>
+          <w:p>
+            <w:pPr>
+              <w:spacing w:before="0" w:after="0" w:line="240" w:lineRule="auto"/>
+              <w:jc w:val="center"/>
+            </w:pPr>
+            <w:r>
+              <w:t>https://x.com/jornaldarecord/status/2096050670344589359</w:t>
+            </w:r>
+          </w:p>
+        </w:tc>
+        <w:tc>
+          <w:tcPr>
+            <w:tcW w:type="dxa" w:w="1152"/>
+            <w:vAlign w:val="center"/>
+            <w:tcMar>
+              <w:top w:w="0" w:type="dxa"/>
+              <w:start w:w="60" w:type="dxa"/>
+              <w:bottom w:w="0" w:type="dxa"/>
+              <w:end w:w="60" w:type="dxa"/>
+            </w:tcMar>
+          </w:tcPr>
+          <w:p>
+            <w:pPr>
+              <w:spacing w:before="0" w:after="0" w:line="240" w:lineRule="auto"/>
+              <w:jc w:val="center"/>
+            </w:pPr>
+            <w:r>
+              <w:t>@jornaldarecord</w:t>
+            </w:r>
+          </w:p>
+        </w:tc>
+        <w:tc>
+          <w:tcPr>
+            <w:tcW w:type="dxa" w:w="1080"/>
+            <w:vAlign w:val="center"/>
+            <w:tcMar>
+              <w:top w:w="0" w:type="dxa"/>
+              <w:start w:w="60" w:type="dxa"/>
+              <w:bottom w:w="0" w:type="dxa"/>
+              <w:end w:w="60" w:type="dxa"/>
+            </w:tcMar>
+          </w:tcPr>
+          <w:p>
+            <w:pPr>
+              <w:spacing w:before="0" w:after="0" w:line="240" w:lineRule="auto"/>
+              <w:jc w:val="center"/>
+            </w:pPr>
+            <w:r>
+              <w:drawing>
+                <wp:inline xmlns:a="http://schemas.openxmlformats.org/drawingml/2006/main" xmlns:pic="http://schemas.openxmlformats.org/drawingml/2006/picture">
+                  <wp:extent cx="438912" cy="438912"/>
+                  <wp:docPr id="8" name="Picture 8"/>
+                  <wp:cNvGraphicFramePr>
+                    <a:graphicFrameLocks noChangeAspect="1"/>
+                  </wp:cNvGraphicFramePr>
+                  <a:graphic>
+                    <a:graphicData uri="http://schemas.openxmlformats.org/drawingml/2006/picture">
+                      <pic:pic>
+                        <pic:nvPicPr>
+                          <pic:cNvPr id="0" name="profile_4.jpg"/>
+                          <pic:cNvPicPr/>
+                        </pic:nvPicPr>
+                        <pic:blipFill>
+                          <a:blip r:embed="rId16"/>
+                          <a:stretch>
+                            <a:fillRect/>
+                          </a:stretch>
+                        </pic:blipFill>
+                        <pic:spPr>
+                          <a:xfrm>
+                            <a:off x="0" y="0"/>
+                            <a:ext cx="438912" cy="438912"/>
+                          </a:xfrm>
+                          <a:prstGeom prst="rect"/>
+                        </pic:spPr>
+                      </pic:pic>
+                    </a:graphicData>
+                  </a:graphic>
+                </wp:inline>
+              </w:drawing>
             </w:r>
           </w:p>
         </w:tc>
@@ -176,7 +826,7 @@
     </w:tbl>
     <w:sectPr>
       <w:pgSz w:w="12240" w:h="15840"/>
-      <w:pgMar w:top="1440" w:right="1800" w:bottom="1440" w:left="1800" w:header="720" w:footer="720" w:gutter="0"/>
+      <w:pgMar w:top="648" w:right="648" w:bottom="648" w:left="648" w:header="720" w:footer="720" w:gutter="0"/>
       <w:cols w:space="720"/>
       <w:docGrid w:linePitch="360"/>
     </w:sectPr>

</xml_diff>